<commit_message>
Strip emoji + decorative icons from source files
Remove emoji/decorative unicode (checkmarks, arrows, stars, etc.)
from docs, notebooks, scripts, source code and configs to reduce
AI-generated aesthetic while keeping all meaning intact.

Tool: scripts/strip_emojis.py — preserves Python indentation
(only collapses multi-space within line content, not leading
whitespace), removes trailing whitespace.

Regenerated notebooks + DOCX from cleaned gen scripts.
</commit_message>
<xml_diff>
--- a/docs/BAO_CAO_CHINH_THUC.docx
+++ b/docs/BAO_CAO_CHINH_THUC.docx
@@ -190,7 +190,7 @@
           <w:i/>
           <w:sz w:val="26"/>
         </w:rPr>
-        <w:t>(Sau khi mở file trong Microsoft Word: đặt con trỏ vào đây → tab References → Table of Contents → Insert Table of Contents. Word sẽ tự sinh mục lục từ các heading trong tài liệu.)</w:t>
+        <w:t>(Sau khi mở file trong Microsoft Word: đặt con trỏ vào đây tab References Table of Contents Insert Table of Contents. Word sẽ tự sinh mục lục từ các heading trong tài liệu.)</w:t>
       </w:r>
     </w:p>
     <w:p>
@@ -246,7 +246,7 @@
           <w:i w:val="0"/>
           <w:sz w:val="24"/>
         </w:rPr>
-        <w:t xml:space="preserve">  1.1. Đặt vấn đề</w:t>
+        <w:t xml:space="preserve"> 1.1. Đặt vấn đề</w:t>
       </w:r>
     </w:p>
     <w:p>
@@ -260,7 +260,7 @@
           <w:i w:val="0"/>
           <w:sz w:val="24"/>
         </w:rPr>
-        <w:t xml:space="preserve">  1.2. Mục tiêu và phạm vi</w:t>
+        <w:t xml:space="preserve"> 1.2. Mục tiêu và phạm vi</w:t>
       </w:r>
     </w:p>
     <w:p>
@@ -274,7 +274,7 @@
           <w:i w:val="0"/>
           <w:sz w:val="24"/>
         </w:rPr>
-        <w:t xml:space="preserve">  1.3. Đóng góp của nhóm</w:t>
+        <w:t xml:space="preserve"> 1.3. Đóng góp của nhóm</w:t>
       </w:r>
     </w:p>
     <w:p>
@@ -302,7 +302,7 @@
           <w:i w:val="0"/>
           <w:sz w:val="24"/>
         </w:rPr>
-        <w:t xml:space="preserve">  2.1. Object Detection và YOLOv8</w:t>
+        <w:t xml:space="preserve"> 2.1. Object Detection và YOLOv8</w:t>
       </w:r>
     </w:p>
     <w:p>
@@ -316,7 +316,7 @@
           <w:i w:val="0"/>
           <w:sz w:val="24"/>
         </w:rPr>
-        <w:t xml:space="preserve">  2.2. Multi-Object Tracking và ByteTrack</w:t>
+        <w:t xml:space="preserve"> 2.2. Multi-Object Tracking và ByteTrack</w:t>
       </w:r>
     </w:p>
     <w:p>
@@ -330,7 +330,7 @@
           <w:i w:val="0"/>
           <w:sz w:val="24"/>
         </w:rPr>
-        <w:t xml:space="preserve">  2.3. Bài toán counting theo line/zone</w:t>
+        <w:t xml:space="preserve"> 2.3. Bài toán counting theo line/zone</w:t>
       </w:r>
     </w:p>
     <w:p>
@@ -344,7 +344,7 @@
           <w:i w:val="0"/>
           <w:sz w:val="24"/>
         </w:rPr>
-        <w:t xml:space="preserve">  2.4. Metrics đánh giá</w:t>
+        <w:t xml:space="preserve"> 2.4. Metrics đánh giá</w:t>
       </w:r>
     </w:p>
     <w:p>
@@ -372,7 +372,7 @@
           <w:i w:val="0"/>
           <w:sz w:val="24"/>
         </w:rPr>
-        <w:t xml:space="preserve">  3.1. Kiến trúc pipeline</w:t>
+        <w:t xml:space="preserve"> 3.1. Kiến trúc pipeline</w:t>
       </w:r>
     </w:p>
     <w:p>
@@ -386,7 +386,7 @@
           <w:i w:val="0"/>
           <w:sz w:val="24"/>
         </w:rPr>
-        <w:t xml:space="preserve">  3.2. Module Detection</w:t>
+        <w:t xml:space="preserve"> 3.2. Module Detection</w:t>
       </w:r>
     </w:p>
     <w:p>
@@ -400,7 +400,7 @@
           <w:i w:val="0"/>
           <w:sz w:val="24"/>
         </w:rPr>
-        <w:t xml:space="preserve">  3.3. Module Tracking</w:t>
+        <w:t xml:space="preserve"> 3.3. Module Tracking</w:t>
       </w:r>
     </w:p>
     <w:p>
@@ -414,7 +414,7 @@
           <w:i w:val="0"/>
           <w:sz w:val="24"/>
         </w:rPr>
-        <w:t xml:space="preserve">  3.4. Module Counting với direction</w:t>
+        <w:t xml:space="preserve"> 3.4. Module Counting với direction</w:t>
       </w:r>
     </w:p>
     <w:p>
@@ -428,7 +428,7 @@
           <w:i w:val="0"/>
           <w:sz w:val="24"/>
         </w:rPr>
-        <w:t xml:space="preserve">  3.5. Module Aggregation và Visualization</w:t>
+        <w:t xml:space="preserve"> 3.5. Module Aggregation và Visualization</w:t>
       </w:r>
     </w:p>
     <w:p>
@@ -442,7 +442,7 @@
           <w:i w:val="0"/>
           <w:sz w:val="24"/>
         </w:rPr>
-        <w:t xml:space="preserve">  3.6. Module Evaluation</w:t>
+        <w:t xml:space="preserve"> 3.6. Module Evaluation</w:t>
       </w:r>
     </w:p>
     <w:p>
@@ -470,7 +470,7 @@
           <w:i w:val="0"/>
           <w:sz w:val="24"/>
         </w:rPr>
-        <w:t xml:space="preserve">  4.1. Công nghệ và môi trường</w:t>
+        <w:t xml:space="preserve"> 4.1. Công nghệ và môi trường</w:t>
       </w:r>
     </w:p>
     <w:p>
@@ -484,7 +484,7 @@
           <w:i w:val="0"/>
           <w:sz w:val="24"/>
         </w:rPr>
-        <w:t xml:space="preserve">  4.2. Chuẩn bị dữ liệu</w:t>
+        <w:t xml:space="preserve"> 4.2. Chuẩn bị dữ liệu</w:t>
       </w:r>
     </w:p>
     <w:p>
@@ -498,7 +498,7 @@
           <w:i w:val="0"/>
           <w:sz w:val="24"/>
         </w:rPr>
-        <w:t xml:space="preserve">  4.3. Quá trình training</w:t>
+        <w:t xml:space="preserve"> 4.3. Quá trình training</w:t>
       </w:r>
     </w:p>
     <w:p>
@@ -512,7 +512,7 @@
           <w:i w:val="0"/>
           <w:sz w:val="24"/>
         </w:rPr>
-        <w:t xml:space="preserve">  4.4. Streamlit Web UI</w:t>
+        <w:t xml:space="preserve"> 4.4. Streamlit Web UI</w:t>
       </w:r>
     </w:p>
     <w:p>
@@ -540,7 +540,7 @@
           <w:i w:val="0"/>
           <w:sz w:val="24"/>
         </w:rPr>
-        <w:t xml:space="preserve">  5.1. Kết quả training</w:t>
+        <w:t xml:space="preserve"> 5.1. Kết quả training</w:t>
       </w:r>
     </w:p>
     <w:p>
@@ -554,7 +554,7 @@
           <w:i w:val="0"/>
           <w:sz w:val="24"/>
         </w:rPr>
-        <w:t xml:space="preserve">  5.2. Kết quả detection (mAP)</w:t>
+        <w:t xml:space="preserve"> 5.2. Kết quả detection (mAP)</w:t>
       </w:r>
     </w:p>
     <w:p>
@@ -568,7 +568,7 @@
           <w:i w:val="0"/>
           <w:sz w:val="24"/>
         </w:rPr>
-        <w:t xml:space="preserve">  5.3. Kết quả counting trên video</w:t>
+        <w:t xml:space="preserve"> 5.3. Kết quả counting trên video</w:t>
       </w:r>
     </w:p>
     <w:p>
@@ -582,7 +582,7 @@
           <w:i w:val="0"/>
           <w:sz w:val="24"/>
         </w:rPr>
-        <w:t xml:space="preserve">  5.4. So sánh với baseline</w:t>
+        <w:t xml:space="preserve"> 5.4. So sánh với baseline</w:t>
       </w:r>
     </w:p>
     <w:p>
@@ -610,7 +610,7 @@
           <w:i w:val="0"/>
           <w:sz w:val="24"/>
         </w:rPr>
-        <w:t xml:space="preserve">  6.1. Ưu điểm</w:t>
+        <w:t xml:space="preserve"> 6.1. Ưu điểm</w:t>
       </w:r>
     </w:p>
     <w:p>
@@ -624,7 +624,7 @@
           <w:i w:val="0"/>
           <w:sz w:val="24"/>
         </w:rPr>
-        <w:t xml:space="preserve">  6.2. Hạn chế</w:t>
+        <w:t xml:space="preserve"> 6.2. Hạn chế</w:t>
       </w:r>
     </w:p>
     <w:p>
@@ -638,7 +638,7 @@
           <w:i w:val="0"/>
           <w:sz w:val="24"/>
         </w:rPr>
-        <w:t xml:space="preserve">  6.3. Hướng cải thiện</w:t>
+        <w:t xml:space="preserve"> 6.3. Hướng cải thiện</w:t>
       </w:r>
     </w:p>
     <w:p>
@@ -2223,71 +2223,71 @@
         </w:rPr>
         <w:t>Video (MP4/AVI)</w:t>
         <w:br/>
-        <w:t xml:space="preserve">     │</w:t>
+        <w:t xml:space="preserve"> │</w:t>
         <w:br/>
-        <w:t xml:space="preserve">     ▼</w:t>
+        <w:t xml:space="preserve"> ▼</w:t>
         <w:br/>
         <w:t>┌─────────────────────────────────────────────┐</w:t>
         <w:br/>
-        <w:t>│ [1] DETECTION  — YOLOv8s                    │</w:t>
+        <w:t>│ [1] DETECTION — YOLOv8s │</w:t>
         <w:br/>
-        <w:t>│     Output: boxes (x1,y1,x2,y2), class, conf│</w:t>
+        <w:t>│ Output: boxes (x1,y1,x2,y2), class, conf│</w:t>
         <w:br/>
         <w:t>└─────────────────────────────────────────────┘</w:t>
         <w:br/>
-        <w:t xml:space="preserve">     │</w:t>
+        <w:t xml:space="preserve"> │</w:t>
         <w:br/>
-        <w:t xml:space="preserve">     ▼</w:t>
+        <w:t xml:space="preserve"> ▼</w:t>
         <w:br/>
         <w:t>┌─────────────────────────────────────────────┐</w:t>
         <w:br/>
-        <w:t>│ [2] TRACKING   — ByteTrack                  │</w:t>
+        <w:t>│ [2] TRACKING — ByteTrack │</w:t>
         <w:br/>
-        <w:t>│     Output: track_id ổn định qua frames     │</w:t>
+        <w:t>│ Output: track_id ổn định qua frames │</w:t>
         <w:br/>
         <w:t>└─────────────────────────────────────────────┘</w:t>
         <w:br/>
-        <w:t xml:space="preserve">     │</w:t>
+        <w:t xml:space="preserve"> │</w:t>
         <w:br/>
-        <w:t xml:space="preserve">     ▼</w:t>
+        <w:t xml:space="preserve"> ▼</w:t>
         <w:br/>
         <w:t>┌─────────────────────────────────────────────┐</w:t>
         <w:br/>
-        <w:t>│ [3] COUNTING   — Line + direction           │</w:t>
+        <w:t>│ [3] COUNTING — Line + direction │</w:t>
         <w:br/>
-        <w:t>│     Output: event {frame, line, direction,  │</w:t>
+        <w:t>│ Output: event {frame, line, direction, │</w:t>
         <w:br/>
-        <w:t>│             track_id, class}                │</w:t>
+        <w:t>│ track_id, class} │</w:t>
         <w:br/>
         <w:t>└─────────────────────────────────────────────┘</w:t>
         <w:br/>
-        <w:t xml:space="preserve">     │</w:t>
+        <w:t xml:space="preserve"> │</w:t>
         <w:br/>
-        <w:t xml:space="preserve">     ▼</w:t>
+        <w:t xml:space="preserve"> ▼</w:t>
         <w:br/>
         <w:t>┌─────────────────────────────────────────────┐</w:t>
         <w:br/>
-        <w:t>│ [4] AGGREGATE  — Pandas DataFrame           │</w:t>
+        <w:t>│ [4] AGGREGATE — Pandas DataFrame │</w:t>
         <w:br/>
-        <w:t>│     Output: bucket time × class × direction │</w:t>
+        <w:t>│ Output: bucket time × class × direction │</w:t>
         <w:br/>
         <w:t>└─────────────────────────────────────────────┘</w:t>
         <w:br/>
-        <w:t xml:space="preserve">     │</w:t>
+        <w:t xml:space="preserve"> │</w:t>
         <w:br/>
-        <w:t xml:space="preserve">     ▼</w:t>
+        <w:t xml:space="preserve"> ▼</w:t>
         <w:br/>
         <w:t>┌─────────────────────────────────────────────┐</w:t>
         <w:br/>
-        <w:t>│ [5] VISUALIZE  — Matplotlib                 │</w:t>
+        <w:t>│ [5] VISUALIZE — Matplotlib │</w:t>
         <w:br/>
-        <w:t>│     Output: bar / heatmap / line chart PNG  │</w:t>
+        <w:t>│ Output: bar / heatmap / line chart PNG │</w:t>
         <w:br/>
         <w:t>└─────────────────────────────────────────────┘</w:t>
         <w:br/>
-        <w:t xml:space="preserve">     │</w:t>
+        <w:t xml:space="preserve"> │</w:t>
         <w:br/>
-        <w:t xml:space="preserve">     ▼</w:t>
+        <w:t xml:space="preserve"> ▼</w:t>
         <w:br/>
         <w:t>Video annotated + CSV events + biểu đồ + JSON summary</w:t>
       </w:r>
@@ -2485,51 +2485,51 @@
         </w:rPr>
         <w:t>class Counter:</w:t>
         <w:br/>
-        <w:t xml:space="preserve">    def update(frame_idx, boxes, ids, classes):</w:t>
+        <w:t xml:space="preserve"> def update(frame_idx, boxes, ids, classes):</w:t>
         <w:br/>
-        <w:t xml:space="preserve">        for box, tid, cls in zip(boxes, ids, classes):</w:t>
+        <w:t xml:space="preserve"> for box, tid, cls in zip(boxes, ids, classes):</w:t>
         <w:br/>
-        <w:t xml:space="preserve">            curr = center(box)</w:t>
+        <w:t xml:space="preserve"> curr = center(box)</w:t>
         <w:br/>
-        <w:t xml:space="preserve">            prev = prev_center.get(tid)</w:t>
+        <w:t xml:space="preserve"> prev = prev_center.get(tid)</w:t>
         <w:br/>
-        <w:t xml:space="preserve">            if prev is not None:</w:t>
+        <w:t xml:space="preserve"> if prev is not None:</w:t>
         <w:br/>
-        <w:t xml:space="preserve">                for line in lines:</w:t>
+        <w:t xml:space="preserve"> for line in lines:</w:t>
         <w:br/>
-        <w:t xml:space="preserve">                    if (line.name, tid) in _counted:</w:t>
+        <w:t xml:space="preserve"> if (line.name, tid) in _counted:</w:t>
         <w:br/>
-        <w:t xml:space="preserve">                        continue</w:t>
+        <w:t xml:space="preserve"> continue</w:t>
         <w:br/>
-        <w:t xml:space="preserve">                    if not segments_cross(prev, curr, line.p1, line.p2):</w:t>
+        <w:t xml:space="preserve"> if not segments_cross(prev, curr, line.p1, line.p2):</w:t>
         <w:br/>
-        <w:t xml:space="preserve">                        continue</w:t>
+        <w:t xml:space="preserve"> continue</w:t>
         <w:br/>
-        <w:t xml:space="preserve">                    # Xác định hướng bằng cross-product</w:t>
+        <w:t xml:space="preserve"> # Xác định hướng bằng cross-product</w:t>
         <w:br/>
-        <w:t xml:space="preserve">                    v_line = line.p2 - line.p1</w:t>
+        <w:t xml:space="preserve"> v_line = line.p2 - line.p1</w:t>
         <w:br/>
-        <w:t xml:space="preserve">                    v_move = curr - prev</w:t>
+        <w:t xml:space="preserve"> v_move = curr - prev</w:t>
         <w:br/>
-        <w:t xml:space="preserve">                    cross  = v_line.x * v_move.y - v_line.y * v_move.x</w:t>
+        <w:t xml:space="preserve"> cross = v_line.x * v_move.y - v_line.y * v_move.x</w:t>
         <w:br/>
-        <w:t xml:space="preserve">                    direction = 'ltr' if cross &gt; 0 else 'rtl'</w:t>
+        <w:t xml:space="preserve"> direction = 'ltr' if cross &gt; 0 else 'rtl'</w:t>
         <w:br/>
-        <w:t xml:space="preserve">                    # Filter theo config</w:t>
+        <w:t xml:space="preserve"> # Filter theo config</w:t>
         <w:br/>
-        <w:t xml:space="preserve">                    if line.count_direction not in ('both', direction):</w:t>
+        <w:t xml:space="preserve"> if line.count_direction not in ('both', direction):</w:t>
         <w:br/>
-        <w:t xml:space="preserve">                        _counted.add((line.name, tid))  # skip nhưng đánh dấu</w:t>
+        <w:t xml:space="preserve"> _counted.add((line.name, tid)) # skip nhưng đánh dấu</w:t>
         <w:br/>
-        <w:t xml:space="preserve">                        continue</w:t>
+        <w:t xml:space="preserve"> continue</w:t>
         <w:br/>
-        <w:t xml:space="preserve">                    # ĐẾM</w:t>
+        <w:t xml:space="preserve"> # ĐẾM</w:t>
         <w:br/>
-        <w:t xml:space="preserve">                    counts[line.name][direction][cls] += 1</w:t>
+        <w:t xml:space="preserve"> counts[line.name][direction][cls] += 1</w:t>
         <w:br/>
-        <w:t xml:space="preserve">                    _counted.add((line.name, tid))</w:t>
+        <w:t xml:space="preserve"> _counted.add((line.name, tid))</w:t>
         <w:br/>
-        <w:t xml:space="preserve">            prev_center[tid] = curr</w:t>
+        <w:t xml:space="preserve"> prev_center[tid] = curr</w:t>
       </w:r>
     </w:p>
     <w:p>
@@ -3672,26 +3672,26 @@
         <w:t>Canonical schema: {0: motorcycle, 1: car, 2: bus, 3: truck}</w:t>
         <w:br/>
         <w:br/>
-        <w:t>UA-DETRAC (car/bus/van/others) → canonical:</w:t>
+        <w:t>UA-DETRAC (car/bus/van/others) canonical:</w:t>
         <w:br/>
-        <w:t xml:space="preserve">  0 car    → 1 car</w:t>
+        <w:t xml:space="preserve"> 0 car 1 car</w:t>
         <w:br/>
-        <w:t xml:space="preserve">  1 bus    → 2 bus</w:t>
+        <w:t xml:space="preserve"> 1 bus 2 bus</w:t>
         <w:br/>
-        <w:t xml:space="preserve">  2 van    → 3 truck   (van có hình dáng gần truck nhất)</w:t>
+        <w:t xml:space="preserve"> 2 van 3 truck (van có hình dáng gần truck nhất)</w:t>
         <w:br/>
-        <w:t xml:space="preserve">  3 others → BỎ (rác)</w:t>
+        <w:t xml:space="preserve"> 3 others BỎ (rác)</w:t>
         <w:br/>
         <w:br/>
-        <w:t>VN Cần Thơ (bus/car/motorbike/truck) → canonical:</w:t>
+        <w:t>VN Cần Thơ (bus/car/motorbike/truck) canonical:</w:t>
         <w:br/>
-        <w:t xml:space="preserve">  0 bus       → 2 bus</w:t>
+        <w:t xml:space="preserve"> 0 bus 2 bus</w:t>
         <w:br/>
-        <w:t xml:space="preserve">  1 car       → 1 car</w:t>
+        <w:t xml:space="preserve"> 1 car 1 car</w:t>
         <w:br/>
-        <w:t xml:space="preserve">  2 motorbike → 0 motorcycle  ★ giá trị chính từ VN</w:t>
+        <w:t xml:space="preserve"> 2 motorbike 0 motorcycle giá trị chính từ VN</w:t>
         <w:br/>
-        <w:t xml:space="preserve">  3 truck     → 3 truck</w:t>
+        <w:t xml:space="preserve"> 3 truck 3 truck</w:t>
       </w:r>
     </w:p>
     <w:p>
@@ -4941,7 +4941,7 @@
           <w:i w:val="0"/>
           <w:sz w:val="26"/>
         </w:rPr>
-        <w:t>Tab 'Chạy pipeline': upload video, chọn model, điều chỉnh confidence/IoU/imgsz, vị trí line đếm, hướng đếm → chạy pipeline → xem video output có overlay counter.</w:t>
+        <w:t>Tab 'Chạy pipeline': upload video, chọn model, điều chỉnh confidence/IoU/imgsz, vị trí line đếm, hướng đếm chạy pipeline xem video output có overlay counter.</w:t>
       </w:r>
     </w:p>
     <w:p>
@@ -4957,7 +4957,7 @@
           <w:i w:val="0"/>
           <w:sz w:val="26"/>
         </w:rPr>
-        <w:t>Tab 'Thống kê': chọn bucket thời gian (30s → 1h), xem biểu đồ bar/line/heatmap, flow rate, peak period, so sánh giữa các line, cumulative count.</w:t>
+        <w:t>Tab 'Thống kê': chọn bucket thời gian (30s 1h), xem biểu đồ bar/line/heatmap, flow rate, peak period, so sánh giữa các line, cumulative count.</w:t>
       </w:r>
     </w:p>
     <w:p>
@@ -4973,7 +4973,7 @@
           <w:i w:val="0"/>
           <w:sz w:val="26"/>
         </w:rPr>
-        <w:t>Tab 'Đánh giá': upload GT JSON hoặc điền tay → tính accuracy/MAE/MAPE per-class và tổng → download report JSON.</w:t>
+        <w:t>Tab 'Đánh giá': upload GT JSON hoặc điền tay tính accuracy/MAE/MAPE per-class và tổng download report JSON.</w:t>
       </w:r>
     </w:p>
     <w:p>
@@ -6699,7 +6699,7 @@
                 <w:i w:val="0"/>
                 <w:sz w:val="22"/>
               </w:rPr>
-              <w:t>❌ Không</w:t>
+              <w:t xml:space="preserve"> Không</w:t>
             </w:r>
           </w:p>
         </w:tc>
@@ -6719,7 +6719,7 @@
                 <w:i w:val="0"/>
                 <w:sz w:val="22"/>
               </w:rPr>
-              <w:t>✅ Có (mAP 0.871)</w:t>
+              <w:t xml:space="preserve"> Có (mAP 0.871)</w:t>
             </w:r>
           </w:p>
         </w:tc>
@@ -7790,7 +7790,7 @@
           <w:i w:val="0"/>
           <w:sz w:val="24"/>
         </w:rPr>
-        <w:t>Sơ đồ 5 bước: Detection → Tracking → Counting → Aggregate → Visualize</w:t>
+        <w:t>Sơ đồ 5 bước: Detection Tracking Counting Aggregate Visualize</w:t>
       </w:r>
     </w:p>
     <w:p>
@@ -7897,7 +7897,7 @@
           <w:i w:val="0"/>
           <w:sz w:val="24"/>
         </w:rPr>
-        <w:t>Fine-tune từ COCO pretrained → 4 class VN</w:t>
+        <w:t>Fine-tune từ COCO pretrained 4 class VN</w:t>
       </w:r>
     </w:p>
     <w:p>
@@ -7988,7 +7988,7 @@
           <w:i w:val="0"/>
           <w:sz w:val="24"/>
         </w:rPr>
-        <w:t>Merge → schema canonical 4-class {motorcycle, car, bus, truck}</w:t>
+        <w:t>Merge schema canonical 4-class {motorcycle, car, bus, truck}</w:t>
       </w:r>
     </w:p>
     <w:p>
@@ -8186,7 +8186,7 @@
           <w:i w:val="0"/>
           <w:sz w:val="24"/>
         </w:rPr>
-        <w:t>Dấu cross-product &gt; 0 → 'ltr'; &lt; 0 → 'rtl'</w:t>
+        <w:t>Dấu cross-product &gt; 0 'ltr'; &lt; 0 'rtl'</w:t>
       </w:r>
     </w:p>
     <w:p>
@@ -8826,19 +8826,19 @@
         </w:rPr>
         <w:t>python -m src.pipeline.run \</w:t>
         <w:br/>
-        <w:t xml:space="preserve">    --video data/test_videos/raw/demo_traffic.mp4 \</w:t>
+        <w:t xml:space="preserve"> --video data/test_videos/raw/demo_traffic.mp4 \</w:t>
         <w:br/>
-        <w:t xml:space="preserve">    --weights weights/v8s_4cls_best.pt \</w:t>
+        <w:t xml:space="preserve"> --weights weights/v8s_4cls_best.pt \</w:t>
         <w:br/>
-        <w:t xml:space="preserve">    --counting-config configs/counting_zones.json \</w:t>
+        <w:t xml:space="preserve"> --counting-config configs/counting_zones.json \</w:t>
         <w:br/>
-        <w:t xml:space="preserve">    --video-key demo_traffic \</w:t>
+        <w:t xml:space="preserve"> --video-key demo_traffic \</w:t>
         <w:br/>
-        <w:t xml:space="preserve">    --out-csv results/tables/demo_events.csv \</w:t>
+        <w:t xml:space="preserve"> --out-csv results/tables/demo_events.csv \</w:t>
         <w:br/>
-        <w:t xml:space="preserve">    --out-video results/videos/demo_out.mp4 \</w:t>
+        <w:t xml:space="preserve"> --out-video results/videos/demo_out.mp4 \</w:t>
         <w:br/>
-        <w:t xml:space="preserve">    --half</w:t>
+        <w:t xml:space="preserve"> --half</w:t>
       </w:r>
     </w:p>
     <w:p>

</xml_diff>